<commit_message>
release: 26.23.0 execution rules v2 and case-docs refactor
</commit_message>
<xml_diff>
--- a/backend/apps/documents/docx_templates/2-案件材料/4-通用材料/1-授权委托材料/授权委托书.docx
+++ b/backend/apps/documents/docx_templates/2-案件材料/4-通用材料/1-授权委托材料/授权委托书.docx
@@ -349,12 +349,12 @@
         </w:tblCellMar>
       </w:tblPr>
       <w:tblGrid>
-        <w:gridCol w:w="4271"/>
+        <w:gridCol w:w="4893"/>
       </w:tblGrid>
       <w:tr>
         <w:tc>
           <w:tcPr>
-            <w:tcW w:w="4271" w:type="dxa"/>
+            <w:tcW w:w="4893" w:type="dxa"/>
           </w:tcPr>
           <w:p>
             <w:pPr>

</xml_diff>